<commit_message>
docs: specify submenu restructuring (remove community & search, add regional festival entry button)
</commit_message>
<xml_diff>
--- a/public/festival_service_spec.docx
+++ b/public/festival_service_spec.docx
@@ -178,6 +178,93 @@
       </w:pPr>
       <w:r>
         <w:t xml:space="preserve">본 프로토타입에서 검증 완료된 지도 영역(`Bounds`) 필터링, 부드러운 패닝 글라이딩(`panTo`), 줌 레벨 제어, 클러스터링, 반응형 중심 좌표 보정 로직은 네이버 지도 SDK 메서드로 1:1 대응하여 구현함.</w:t>
+      </w:r>
+    </w:p>
+    <w:p>
+      <w:pPr>
+        <w:pStyle w:val="Heading2"/>
+        <w:spacing w:after="80" w:before="160"/>
+      </w:pPr>
+      <w:r>
+        <w:t xml:space="preserve">1.4. 한경 트래블 사이트 연동 및 서브메뉴 개편 정책 (진입점 사양)</w:t>
+      </w:r>
+    </w:p>
+    <w:p>
+      <w:pPr>
+        <w:pStyle w:val="ListParagraph"/>
+        <w:numPr>
+          <w:ilvl w:val="0"/>
+          <w:numId w:val="1"/>
+        </w:numPr>
+        <w:spacing w:after="60"/>
+      </w:pPr>
+      <w:r>
+        <w:t xml:space="preserve">**한경 트래블 GNB 서브메뉴 개편 사항**:</w:t>
+      </w:r>
+    </w:p>
+    <w:p>
+      <w:pPr>
+        <w:pStyle w:val="ListParagraph"/>
+        <w:numPr>
+          <w:ilvl w:val="0"/>
+          <w:numId w:val="1"/>
+        </w:numPr>
+        <w:spacing w:after="60"/>
+      </w:pPr>
+      <w:r>
+        <w:t xml:space="preserve">**삭제 대상 메뉴**: 기존 서브메뉴 중 **`커뮤니티`** 및 **`검색`** 메뉴 2종을 전면 삭제 처리함.</w:t>
+      </w:r>
+    </w:p>
+    <w:p>
+      <w:pPr>
+        <w:pStyle w:val="ListParagraph"/>
+        <w:numPr>
+          <w:ilvl w:val="0"/>
+          <w:numId w:val="1"/>
+        </w:numPr>
+        <w:spacing w:after="60"/>
+      </w:pPr>
+      <w:r>
+        <w:t xml:space="preserve">**신규 진입점 추가**: 서브메뉴 **맨 우측 위치에 `지역축제` 신규 메뉴 버튼을 신설**하여 메인 진입점으로 활용함.</w:t>
+      </w:r>
+    </w:p>
+    <w:p>
+      <w:pPr>
+        <w:pStyle w:val="ListParagraph"/>
+        <w:numPr>
+          <w:ilvl w:val="0"/>
+          <w:numId w:val="1"/>
+        </w:numPr>
+        <w:spacing w:after="60"/>
+      </w:pPr>
+      <w:r>
+        <w:t xml:space="preserve">**진입점 동작 정책**:</w:t>
+      </w:r>
+    </w:p>
+    <w:p>
+      <w:pPr>
+        <w:pStyle w:val="ListParagraph"/>
+        <w:numPr>
+          <w:ilvl w:val="0"/>
+          <w:numId w:val="1"/>
+        </w:numPr>
+        <w:spacing w:after="60"/>
+      </w:pPr>
+      <w:r>
+        <w:t xml:space="preserve">사용자 클릭 시 전국 지역축제 인터랙티브 지도 페이지(단일 화면 풀스크린 뷰)로 즉시 전환 연결함.</w:t>
+      </w:r>
+    </w:p>
+    <w:p>
+      <w:pPr>
+        <w:pStyle w:val="ListParagraph"/>
+        <w:numPr>
+          <w:ilvl w:val="0"/>
+          <w:numId w:val="1"/>
+        </w:numPr>
+        <w:spacing w:after="60"/>
+      </w:pPr>
+      <w:r>
+        <w:t xml:space="preserve">최초 진입 시 정책에 따라 '한경 트래블 PICK'이 기본 선택된 최적의 뷰포트 상태로 로드됨.</w:t>
       </w:r>
     </w:p>
     <w:p>

</xml_diff>

<commit_message>
docs: integrate comprehensive specifications (user flow, fallback policies, admin operation, TourAPI caching) into final PM spec
</commit_message>
<xml_diff>
--- a/public/festival_service_spec.docx
+++ b/public/festival_service_spec.docx
@@ -16,7 +16,7 @@
         <w:spacing w:after="100"/>
       </w:pPr>
       <w:r>
-        <w:t xml:space="preserve">본 문서는 전국 지역축제 인터랙티브 지도 서비스의 목적, 화면 구성 체계, 사용자 기능, 화면 전환 및 데이터 정책을 기술함.</w:t>
+        <w:t xml:space="preserve">본 문서는 전국 지역축제 인터랙티브 지도 플랫폼의 서비스 개요, 이용 흐름, 사용자 인터페이스(UI), 상세 화면 구성, 운영 관리자 기능, 시스템 및 데이터 정책을 기술함.</w:t>
       </w:r>
     </w:p>
     <w:p>
@@ -68,6 +68,19 @@
         <w:spacing w:after="60"/>
       </w:pPr>
       <w:r>
+        <w:t xml:space="preserve">**데이터 출처**: 한국관광공사 공공데이터(TourAPI)를 연동·가공하여 독자적인 축제 데이터베이스로 구축 및 운영함.</w:t>
+      </w:r>
+    </w:p>
+    <w:p>
+      <w:pPr>
+        <w:pStyle w:val="ListParagraph"/>
+        <w:numPr>
+          <w:ilvl w:val="0"/>
+          <w:numId w:val="1"/>
+        </w:numPr>
+        <w:spacing w:after="60"/>
+      </w:pPr>
+      <w:r>
         <w:t xml:space="preserve">**주요 대상**: 주말 여행객, 가족 단위 나들이객, 지역 문화행사 탐색자.</w:t>
       </w:r>
     </w:p>
@@ -81,7 +94,7 @@
         <w:spacing w:after="60"/>
       </w:pPr>
       <w:r>
-        <w:t xml:space="preserve">**제공 환경**: 반응형 웹 (PC 및 모바일 웹 브라우저 지원).</w:t>
+        <w:t xml:space="preserve">**제공 환경**: 반응형 웹 (PC 및 모바일 웹 브라우저 완벽 대응).</w:t>
       </w:r>
     </w:p>
     <w:p>
@@ -90,33 +103,46 @@
         <w:spacing w:after="80" w:before="160"/>
       </w:pPr>
       <w:r>
-        <w:t xml:space="preserve">1.2. 화면 및 운영 기본 정책</w:t>
-      </w:r>
-    </w:p>
-    <w:p>
-      <w:pPr>
-        <w:pStyle w:val="ListParagraph"/>
-        <w:numPr>
-          <w:ilvl w:val="0"/>
-          <w:numId w:val="1"/>
-        </w:numPr>
-        <w:spacing w:after="60"/>
-      </w:pPr>
-      <w:r>
-        <w:t xml:space="preserve">**단일 화면 완결형 구조**: 불필요한 하단 스크롤을 배제하고 상단 헤더, 풀스크린 지도, 탐색 패널의 유기적 결합을 통해 한 화면 내에서 탐색을 완결함.</w:t>
-      </w:r>
-    </w:p>
-    <w:p>
-      <w:pPr>
-        <w:pStyle w:val="ListParagraph"/>
-        <w:numPr>
-          <w:ilvl w:val="0"/>
-          <w:numId w:val="1"/>
-        </w:numPr>
-        <w:spacing w:after="60"/>
-      </w:pPr>
-      <w:r>
-        <w:t xml:space="preserve">**데이터 갱신 주기**: 공공데이터 기반 1일 1회 정기 갱신을 통해 최신 정보를 유지함.</w:t>
+        <w:t xml:space="preserve">1.2. 기본 운영 원칙</w:t>
+      </w:r>
+    </w:p>
+    <w:p>
+      <w:pPr>
+        <w:pStyle w:val="ListParagraph"/>
+        <w:numPr>
+          <w:ilvl w:val="0"/>
+          <w:numId w:val="1"/>
+        </w:numPr>
+        <w:spacing w:after="60"/>
+      </w:pPr>
+      <w:r>
+        <w:t xml:space="preserve">**단일 화면 완결형 구조**: 불필요한 하단 스크롤을 배제하고 상단 헤더, 풀스크린 지도, 탐색 패널의 유기적 결합을 통해 단일 화면 내에서 모든 탐색을 완결함.</w:t>
+      </w:r>
+    </w:p>
+    <w:p>
+      <w:pPr>
+        <w:pStyle w:val="ListParagraph"/>
+        <w:numPr>
+          <w:ilvl w:val="0"/>
+          <w:numId w:val="1"/>
+        </w:numPr>
+        <w:spacing w:after="60"/>
+      </w:pPr>
+      <w:r>
+        <w:t xml:space="preserve">**일일 1회 정기 갱신**: 한국관광공사 데이터를 매일 1회 정기 동기화하여 자체 데이터베이스로 관리함 (사용자 화면 접속 시 외부 API를 실시간 호출하지 않고 자체 DB를 조회하여 초고속 응답과 서비스 안정성을 보장함).</w:t>
+      </w:r>
+    </w:p>
+    <w:p>
+      <w:pPr>
+        <w:pStyle w:val="ListParagraph"/>
+        <w:numPr>
+          <w:ilvl w:val="0"/>
+          <w:numId w:val="1"/>
+        </w:numPr>
+        <w:spacing w:after="60"/>
+      </w:pPr>
+      <w:r>
+        <w:t xml:space="preserve">**자체 화면 완결형 상세 정보**: 축제 개요, 이용요금, 운영시간, 상세 소개, 행사 프로그램, 현장 갤러리까지 서비스 내부 상세 화면에서 원스톱으로 제공함.</w:t>
       </w:r>
     </w:p>
     <w:p>
@@ -138,7 +164,7 @@
         <w:spacing w:after="60"/>
       </w:pPr>
       <w:r>
-        <w:t xml:space="preserve">**프로토타입 환경**: 기능 검증 및 사용성 테스트 목적으로 카카오 지도 기반으로 구축함.</w:t>
+        <w:t xml:space="preserve">**프로토타입 환경**: 빠른 기능 검증 및 사용성 테스트를 위해 카카오 지도(Kakao Maps SDK) 기반으로 구축함.</w:t>
       </w:r>
     </w:p>
     <w:p>
@@ -164,20 +190,20 @@
         <w:spacing w:after="60"/>
       </w:pPr>
       <w:r>
-        <w:t xml:space="preserve">**상용 서비스 개발 시에는 한국경제 닷컴 표준 환경에 맞추어 네이버 지도(Naver Maps API)로 전환 개발함.**</w:t>
-      </w:r>
-    </w:p>
-    <w:p>
-      <w:pPr>
-        <w:pStyle w:val="ListParagraph"/>
-        <w:numPr>
-          <w:ilvl w:val="0"/>
-          <w:numId w:val="1"/>
-        </w:numPr>
-        <w:spacing w:after="60"/>
-      </w:pPr>
-      <w:r>
-        <w:t xml:space="preserve">프로토타입에서 정의된 화면 좌표 영역 필터링, 부드러운 화면 이동, 축척 제어, 마커 그룹화(클러스터링), 반응형 중심점 보정 정책을 네이버 지도 기능으로 동일하게 구현함.</w:t>
+        <w:t xml:space="preserve">**상용 서비스 개발 시에는 한국경제 닷컴(hankyung.com) 표준 환경에 맞추어 네이버 지도(Naver Maps API v3)로 전환 개발함.**</w:t>
+      </w:r>
+    </w:p>
+    <w:p>
+      <w:pPr>
+        <w:pStyle w:val="ListParagraph"/>
+        <w:numPr>
+          <w:ilvl w:val="0"/>
+          <w:numId w:val="1"/>
+        </w:numPr>
+        <w:spacing w:after="60"/>
+      </w:pPr>
+      <w:r>
+        <w:t xml:space="preserve">프로토타입에서 검증 완료된 지도 영역(`Bounds`) 필터링, 부드러운 화면 이동(글라이딩), 축척 제어, 마커 그룹화(클러스터링), 반응형 중심점 보정 로직을 네이버 지도 기능으로 1:1 동일하게 구현함.</w:t>
       </w:r>
     </w:p>
     <w:p>
@@ -199,33 +225,33 @@
         <w:spacing w:after="60"/>
       </w:pPr>
       <w:r>
-        <w:t xml:space="preserve">**상단 서브메뉴 개편 사항**:</w:t>
-      </w:r>
-    </w:p>
-    <w:p>
-      <w:pPr>
-        <w:pStyle w:val="ListParagraph"/>
-        <w:numPr>
-          <w:ilvl w:val="0"/>
-          <w:numId w:val="1"/>
-        </w:numPr>
-        <w:spacing w:after="60"/>
-      </w:pPr>
-      <w:r>
-        <w:t xml:space="preserve">기존 서브메뉴 중 **커뮤니티** 및 **검색** 메뉴는 서비스 정리 정책에 따라 삭제함.</w:t>
-      </w:r>
-    </w:p>
-    <w:p>
-      <w:pPr>
-        <w:pStyle w:val="ListParagraph"/>
-        <w:numPr>
-          <w:ilvl w:val="0"/>
-          <w:numId w:val="1"/>
-        </w:numPr>
-        <w:spacing w:after="60"/>
-      </w:pPr>
-      <w:r>
-        <w:t xml:space="preserve">서브메뉴 **우측 끝 위치에 `지역축제` 신규 메뉴 버튼을 신설**하여 주요 진입점으로 연결함.</w:t>
+        <w:t xml:space="preserve">**한경 트래블 상단 서브메뉴(GNB) 개편 사항**:</w:t>
+      </w:r>
+    </w:p>
+    <w:p>
+      <w:pPr>
+        <w:pStyle w:val="ListParagraph"/>
+        <w:numPr>
+          <w:ilvl w:val="0"/>
+          <w:numId w:val="1"/>
+        </w:numPr>
+        <w:spacing w:after="60"/>
+      </w:pPr>
+      <w:r>
+        <w:t xml:space="preserve">기존 서브메뉴 중 **커뮤니티** 및 **검색** 메뉴 2종을 서비스 정리 정책에 따라 전면 삭제함.</w:t>
+      </w:r>
+    </w:p>
+    <w:p>
+      <w:pPr>
+        <w:pStyle w:val="ListParagraph"/>
+        <w:numPr>
+          <w:ilvl w:val="0"/>
+          <w:numId w:val="1"/>
+        </w:numPr>
+        <w:spacing w:after="60"/>
+      </w:pPr>
+      <w:r>
+        <w:t xml:space="preserve">서브메뉴 **우측 끝 위치에 `지역축제` 신규 메뉴 버튼을 신설**하여 메인 진입점으로 연결함.</w:t>
       </w:r>
     </w:p>
     <w:p>
@@ -251,20 +277,20 @@
         <w:spacing w:after="60"/>
       </w:pPr>
       <w:r>
-        <w:t xml:space="preserve">메뉴 클릭 시 지역축제 지도 화면으로 즉시 연결됨.</w:t>
-      </w:r>
-    </w:p>
-    <w:p>
-      <w:pPr>
-        <w:pStyle w:val="ListParagraph"/>
-        <w:numPr>
-          <w:ilvl w:val="0"/>
-          <w:numId w:val="1"/>
-        </w:numPr>
-        <w:spacing w:after="60"/>
-      </w:pPr>
-      <w:r>
-        <w:t xml:space="preserve">최초 진입 시 에디터 추천 축제(한경 트래블 PICK)가 기본 노출되도록 구성함.</w:t>
+        <w:t xml:space="preserve">사용자 클릭 시 전국 지역축제 인터랙티브 지도 화면으로 즉시 이동함.</w:t>
+      </w:r>
+    </w:p>
+    <w:p>
+      <w:pPr>
+        <w:pStyle w:val="ListParagraph"/>
+        <w:numPr>
+          <w:ilvl w:val="0"/>
+          <w:numId w:val="1"/>
+        </w:numPr>
+        <w:spacing w:after="60"/>
+      </w:pPr>
+      <w:r>
+        <w:t xml:space="preserve">최초 진입 시 에디터 추천 축제(한경 트래블 PICK)가 기본 선택된 최적의 화면 상태로 로드됨.</w:t>
       </w:r>
     </w:p>
     <w:p>
@@ -281,7 +307,296 @@
         <w:spacing w:after="100" w:before="200"/>
       </w:pPr>
       <w:r>
-        <w:t xml:space="preserve">2. 화면 구조 및 사용자 인터페이스(UI) 구성</w:t>
+        <w:t xml:space="preserve">2. 사용자 이용 흐름 (User Flow)</w:t>
+      </w:r>
+    </w:p>
+    <w:p>
+      <w:pPr>
+        <w:spacing w:after="100"/>
+      </w:pPr>
+      <w:r>
+        <w:t xml:space="preserve">사용자가 한경 트래블을 통해 지역축제 서비스에 진입하여 탐색하는 전체 흐름은 다음과 같음:</w:t>
+      </w:r>
+    </w:p>
+    <w:p>
+      <w:pPr>
+        <w:spacing w:after="100"/>
+      </w:pPr>
+      <w:r>
+        <w:t xml:space="preserve">```</w:t>
+      </w:r>
+    </w:p>
+    <w:p>
+      <w:pPr>
+        <w:spacing w:after="100"/>
+      </w:pPr>
+      <w:r>
+        <w:t xml:space="preserve">[한경 트래블 상단 메뉴]</w:t>
+      </w:r>
+    </w:p>
+    <w:p>
+      <w:pPr>
+        <w:spacing w:after="100"/>
+      </w:pPr>
+      <w:r>
+        <w:t xml:space="preserve">│</w:t>
+      </w:r>
+    </w:p>
+    <w:p>
+      <w:pPr>
+        <w:spacing w:after="100"/>
+      </w:pPr>
+      <w:r>
+        <w:t xml:space="preserve">▼ ('지역축제' 클릭)</w:t>
+      </w:r>
+    </w:p>
+    <w:p>
+      <w:pPr>
+        <w:spacing w:after="100"/>
+      </w:pPr>
+      <w:r>
+        <w:t xml:space="preserve">[지역축제 메인 지도 화면]</w:t>
+      </w:r>
+    </w:p>
+    <w:p>
+      <w:pPr>
+        <w:spacing w:after="100"/>
+      </w:pPr>
+      <w:r>
+        <w:t xml:space="preserve">│</w:t>
+      </w:r>
+    </w:p>
+    <w:p>
+      <w:pPr>
+        <w:spacing w:after="100"/>
+      </w:pPr>
+      <w:r>
+        <w:t xml:space="preserve">├─► [상단 헤더] ── 브랜드 로고 및 타이틀 노출</w:t>
+      </w:r>
+    </w:p>
+    <w:p>
+      <w:pPr>
+        <w:spacing w:after="100"/>
+      </w:pPr>
+      <w:r>
+        <w:t xml:space="preserve">│</w:t>
+      </w:r>
+    </w:p>
+    <w:p>
+      <w:pPr>
+        <w:spacing w:after="100"/>
+      </w:pPr>
+      <w:r>
+        <w:t xml:space="preserve">├─► [메인 지도 영역]</w:t>
+      </w:r>
+    </w:p>
+    <w:p>
+      <w:pPr>
+        <w:spacing w:after="100"/>
+      </w:pPr>
+      <w:r>
+        <w:t xml:space="preserve">│       ├─► 전국 축제 마커 및 클러스터링(밀집 숫자) 표기</w:t>
+      </w:r>
+    </w:p>
+    <w:p>
+      <w:pPr>
+        <w:spacing w:after="100"/>
+      </w:pPr>
+      <w:r>
+        <w:t xml:space="preserve">│       ├─► 내 위치 찾기 (GPS 연동 현 위치 지도 이동)</w:t>
+      </w:r>
+    </w:p>
+    <w:p>
+      <w:pPr>
+        <w:spacing w:after="100"/>
+      </w:pPr>
+      <w:r>
+        <w:t xml:space="preserve">│       ├─► 지도 직접 이동/줌 조작 ──► [현 지도에서 검색] 플로팅 버튼 노출 ──► 클릭 시 화면 내 축제 재정렬</w:t>
+      </w:r>
+    </w:p>
+    <w:p>
+      <w:pPr>
+        <w:spacing w:after="100"/>
+      </w:pPr>
+      <w:r>
+        <w:t xml:space="preserve">│       └─► 개별 축제 마커 클릭 ──► 우측 플로팅 상세 패널 오픈 &amp; 해당 위치로 지도 포커싱</w:t>
+      </w:r>
+    </w:p>
+    <w:p>
+      <w:pPr>
+        <w:spacing w:after="100"/>
+      </w:pPr>
+      <w:r>
+        <w:t xml:space="preserve">│</w:t>
+      </w:r>
+    </w:p>
+    <w:p>
+      <w:pPr>
+        <w:spacing w:after="100"/>
+      </w:pPr>
+      <w:r>
+        <w:t xml:space="preserve">├─► [좌측 검색 및 탐색 패널] (모바일은 하단 서랍형 바텀시트)</w:t>
+      </w:r>
+    </w:p>
+    <w:p>
+      <w:pPr>
+        <w:spacing w:after="100"/>
+      </w:pPr>
+      <w:r>
+        <w:t xml:space="preserve">│       ├─► 통합 검색창 (축제명 / 지역명 검색 및 X 버튼 리셋)</w:t>
+      </w:r>
+    </w:p>
+    <w:p>
+      <w:pPr>
+        <w:spacing w:after="100"/>
+      </w:pPr>
+      <w:r>
+        <w:t xml:space="preserve">│       ├─► 추천 테마 롤링 배너 (한경 트래블 PICK 등 선택 시 테마 축제 즉시 필터링)</w:t>
+      </w:r>
+    </w:p>
+    <w:p>
+      <w:pPr>
+        <w:spacing w:after="100"/>
+      </w:pPr>
+      <w:r>
+        <w:t xml:space="preserve">│       ├─► 결과 카운트 안내 ("총 OO개의 축제가 있습니다.")</w:t>
+      </w:r>
+    </w:p>
+    <w:p>
+      <w:pPr>
+        <w:spacing w:after="100"/>
+      </w:pPr>
+      <w:r>
+        <w:t xml:space="preserve">│       ├─► 진행 상태 다중 필터 (진행중 / 예정 / 종료 체크박스 토글)</w:t>
+      </w:r>
+    </w:p>
+    <w:p>
+      <w:pPr>
+        <w:spacing w:after="100"/>
+      </w:pPr>
+      <w:r>
+        <w:t xml:space="preserve">│       └─► 축제 목록 피드 (일정순 정렬 카드)</w:t>
+      </w:r>
+    </w:p>
+    <w:p>
+      <w:pPr>
+        <w:spacing w:after="100"/>
+      </w:pPr>
+      <w:r>
+        <w:t xml:space="preserve">│               │</w:t>
+      </w:r>
+    </w:p>
+    <w:p>
+      <w:pPr>
+        <w:spacing w:after="100"/>
+      </w:pPr>
+      <w:r>
+        <w:t xml:space="preserve">│               ▼ (축제 카드 클릭)</w:t>
+      </w:r>
+    </w:p>
+    <w:p>
+      <w:pPr>
+        <w:spacing w:after="100"/>
+      </w:pPr>
+      <w:r>
+        <w:t xml:space="preserve">└─► [플로팅 상세 정보 패널] (모바일은 풀사이즈 바텀시트 모달)</w:t>
+      </w:r>
+    </w:p>
+    <w:p>
+      <w:pPr>
+        <w:spacing w:after="100"/>
+      </w:pPr>
+      <w:r>
+        <w:t xml:space="preserve">├─► 대표 포스터 (원본 비율 노출 및 터치 시 라이트박스 확대)</w:t>
+      </w:r>
+    </w:p>
+    <w:p>
+      <w:pPr>
+        <w:spacing w:after="100"/>
+      </w:pPr>
+      <w:r>
+        <w:t xml:space="preserve">├─► 헤더 정보 (진행 상태 뱃지, 축제명, 공유하기 링크 복사)</w:t>
+      </w:r>
+    </w:p>
+    <w:p>
+      <w:pPr>
+        <w:spacing w:after="100"/>
+      </w:pPr>
+      <w:r>
+        <w:t xml:space="preserve">├─► 핵심 메타 정보 (기간, 도로명 주소, 운영시간, 이용요금, 문의처 전화걸기)</w:t>
+      </w:r>
+    </w:p>
+    <w:p>
+      <w:pPr>
+        <w:spacing w:after="100"/>
+      </w:pPr>
+      <w:r>
+        <w:t xml:space="preserve">├─► 길찾기 연동 (네이버지도, 카카오맵 길찾기 아웃링크)</w:t>
+      </w:r>
+    </w:p>
+    <w:p>
+      <w:pPr>
+        <w:spacing w:after="100"/>
+      </w:pPr>
+      <w:r>
+        <w:t xml:space="preserve">├─► 상세 소개글 (데이터 부재 시 준비 중 안내 모듈 유지)</w:t>
+      </w:r>
+    </w:p>
+    <w:p>
+      <w:pPr>
+        <w:spacing w:after="100"/>
+      </w:pPr>
+      <w:r>
+        <w:t xml:space="preserve">├─► 주요 행사 프로그램 (데이터 부재 시 안내 모듈 유지)</w:t>
+      </w:r>
+    </w:p>
+    <w:p>
+      <w:pPr>
+        <w:spacing w:after="100"/>
+      </w:pPr>
+      <w:r>
+        <w:t xml:space="preserve">├─► 부대행사 및 특별 프로그램 (데이터 부재 시 안내 모듈 유지)</w:t>
+      </w:r>
+    </w:p>
+    <w:p>
+      <w:pPr>
+        <w:spacing w:after="100"/>
+      </w:pPr>
+      <w:r>
+        <w:t xml:space="preserve">├─► 현장 갤러리 피드 (세로 피드 노출 및 사진 확대 뷰어)</w:t>
+      </w:r>
+    </w:p>
+    <w:p>
+      <w:pPr>
+        <w:spacing w:after="100"/>
+      </w:pPr>
+      <w:r>
+        <w:t xml:space="preserve">└─► 공식 홈페이지 바로가기 (외부 새 창 연결)</w:t>
+      </w:r>
+    </w:p>
+    <w:p>
+      <w:pPr>
+        <w:spacing w:after="100"/>
+      </w:pPr>
+      <w:r>
+        <w:t xml:space="preserve">```</w:t>
+      </w:r>
+    </w:p>
+    <w:p>
+      <w:pPr>
+        <w:spacing w:after="100"/>
+      </w:pPr>
+      <w:r>
+        <w:t xml:space="preserve">---</w:t>
+      </w:r>
+    </w:p>
+    <w:p>
+      <w:pPr>
+        <w:pStyle w:val="Heading1"/>
+        <w:spacing w:after="100" w:before="200"/>
+      </w:pPr>
+      <w:r>
+        <w:t xml:space="preserve">3. 메인 화면 구성 및 상세 인터페이스(UI) 정의</w:t>
       </w:r>
     </w:p>
     <w:p>
@@ -290,7 +605,7 @@
         <w:spacing w:after="80" w:before="160"/>
       </w:pPr>
       <w:r>
-        <w:t xml:space="preserve">2.1. 상단 헤더</w:t>
+        <w:t xml:space="preserve">3.1. 상단 헤더</w:t>
       </w:r>
     </w:p>
     <w:p>
@@ -342,7 +657,7 @@
         <w:spacing w:after="60"/>
       </w:pPr>
       <w:r>
-        <w:t xml:space="preserve">지도 화면 영역을 최대로 확보하기 위해 로그인 및 기타 부가 메뉴는 배제함.</w:t>
+        <w:t xml:space="preserve">지도 화면 영역을 최대로 확보하기 위해 로그인 및 기타 부가 메뉴는 전면 배제함.</w:t>
       </w:r>
     </w:p>
     <w:p>
@@ -351,7 +666,7 @@
         <w:spacing w:after="80" w:before="160"/>
       </w:pPr>
       <w:r>
-        <w:t xml:space="preserve">2.2. 메인 지도 화면</w:t>
+        <w:t xml:space="preserve">3.2. 메인 지도 화면</w:t>
       </w:r>
     </w:p>
     <w:p>
@@ -377,7 +692,7 @@
         <w:spacing w:after="60"/>
       </w:pPr>
       <w:r>
-        <w:t xml:space="preserve">**지도 컨트롤 및 탐색**:</w:t>
+        <w:t xml:space="preserve">**지도 컨트롤 및 인터랙션**:</w:t>
       </w:r>
     </w:p>
     <w:p>
@@ -425,7 +740,7 @@
         <w:spacing w:after="80" w:before="160"/>
       </w:pPr>
       <w:r>
-        <w:t xml:space="preserve">2.3. 검색 및 탐색 패널</w:t>
+        <w:t xml:space="preserve">3.3. 검색 및 탐색 패널</w:t>
       </w:r>
     </w:p>
     <w:p>
@@ -587,7 +902,7 @@
         <w:spacing w:after="100"/>
       </w:pPr>
       <w:r>
-        <w:t xml:space="preserve">4. **진행 상태 필터 (체크박스 토글)**:</w:t>
+        <w:t xml:space="preserve">4. **진행 상태 필터 (체크박스 다중 선택)**:</w:t>
       </w:r>
     </w:p>
     <w:p>
@@ -695,137 +1010,128 @@
         <w:spacing w:after="80" w:before="160"/>
       </w:pPr>
       <w:r>
-        <w:t xml:space="preserve">2.4. 축제 상세 정보 패널</w:t>
-      </w:r>
-    </w:p>
-    <w:p>
-      <w:pPr>
-        <w:pStyle w:val="ListParagraph"/>
-        <w:numPr>
-          <w:ilvl w:val="0"/>
-          <w:numId w:val="1"/>
-        </w:numPr>
-        <w:spacing w:after="60"/>
-      </w:pPr>
-      <w:r>
-        <w:t xml:space="preserve">**노출 시점**: 목록 카드 클릭 또는 지도 상의 개별 마커 클릭 시 즉시 노출.</w:t>
-      </w:r>
-    </w:p>
-    <w:p>
-      <w:pPr>
-        <w:pStyle w:val="ListParagraph"/>
-        <w:numPr>
-          <w:ilvl w:val="0"/>
-          <w:numId w:val="1"/>
-        </w:numPr>
-        <w:spacing w:after="60"/>
-      </w:pPr>
-      <w:r>
-        <w:t xml:space="preserve">**배치 형태**: PC에서는 좌측 검색 패널 우측에 나란히 플로팅 노출되며, 모바일에서는 화면을 채우는 바텀시트 모달로 노출됨.</w:t>
-      </w:r>
-    </w:p>
-    <w:p>
-      <w:pPr>
-        <w:pStyle w:val="ListParagraph"/>
-        <w:numPr>
-          <w:ilvl w:val="0"/>
-          <w:numId w:val="1"/>
-        </w:numPr>
-        <w:spacing w:after="60"/>
-      </w:pPr>
-      <w:r>
-        <w:t xml:space="preserve">**스크롤 초기화 정책**: 상세 패널이 열려 있는 상태에서 다른 축제를 연속으로 선택하더라도, 이전 축제의 스크롤 잔류 없이 항상 상세 화면의 맨 위부터 표시되도록 함.</w:t>
-      </w:r>
-    </w:p>
-    <w:p>
-      <w:pPr>
-        <w:pStyle w:val="ListParagraph"/>
-        <w:numPr>
-          <w:ilvl w:val="0"/>
-          <w:numId w:val="1"/>
-        </w:numPr>
-        <w:spacing w:after="60"/>
-      </w:pPr>
-      <w:r>
-        <w:t xml:space="preserve">**상세 패널 내부 구성**:</w:t>
-      </w:r>
-    </w:p>
-    <w:p>
-      <w:pPr>
-        <w:pStyle w:val="ListParagraph"/>
-        <w:numPr>
-          <w:ilvl w:val="0"/>
-          <w:numId w:val="1"/>
-        </w:numPr>
-        <w:spacing w:after="60"/>
-      </w:pPr>
-      <w:r>
-        <w:t xml:space="preserve">대표 이미지: 원본 비율을 보존하여 노출하며, 터치 시 크게 볼 수 있는 확대 보기 지원.</w:t>
-      </w:r>
-    </w:p>
-    <w:p>
-      <w:pPr>
-        <w:pStyle w:val="ListParagraph"/>
-        <w:numPr>
-          <w:ilvl w:val="0"/>
-          <w:numId w:val="1"/>
-        </w:numPr>
-        <w:spacing w:after="60"/>
-      </w:pPr>
-      <w:r>
-        <w:t xml:space="preserve">기본 정보: 축제명, 진행 상태, 행사 기간, 도로명/지번 주소, 전화번호, 공식 홈페이지 바로가기 링크.</w:t>
-      </w:r>
-    </w:p>
-    <w:p>
-      <w:pPr>
-        <w:pStyle w:val="ListParagraph"/>
-        <w:numPr>
-          <w:ilvl w:val="0"/>
-          <w:numId w:val="1"/>
-        </w:numPr>
-        <w:spacing w:after="60"/>
-      </w:pPr>
-      <w:r>
-        <w:t xml:space="preserve">행사 개요 및 소개 본문.</w:t>
-      </w:r>
-    </w:p>
-    <w:p>
-      <w:pPr>
-        <w:pStyle w:val="ListParagraph"/>
-        <w:numPr>
-          <w:ilvl w:val="0"/>
-          <w:numId w:val="1"/>
-        </w:numPr>
-        <w:spacing w:after="60"/>
-      </w:pPr>
-      <w:r>
-        <w:t xml:space="preserve">길찾기 지원: 주요 지도 앱(네이버지도, 카카오맵)과 연동되는 원클릭 길찾기 아웃링크 제공.</w:t>
-      </w:r>
-    </w:p>
-    <w:p>
-      <w:pPr>
-        <w:pStyle w:val="ListParagraph"/>
-        <w:numPr>
-          <w:ilvl w:val="0"/>
-          <w:numId w:val="1"/>
-        </w:numPr>
-        <w:spacing w:after="60"/>
-      </w:pPr>
-      <w:r>
-        <w:t xml:space="preserve">현장 갤러리 피드: 현장감을 느낄 수 있는 사진들을 아래로 시원하게 볼 수 있는 피드 형태로 배치.</w:t>
-      </w:r>
-    </w:p>
-    <w:p>
-      <w:pPr>
-        <w:pStyle w:val="ListParagraph"/>
-        <w:numPr>
-          <w:ilvl w:val="0"/>
-          <w:numId w:val="1"/>
-        </w:numPr>
-        <w:spacing w:after="60"/>
-      </w:pPr>
-      <w:r>
-        <w:t xml:space="preserve">상단 닫기(X) 버튼 지원.</w:t>
+        <w:t xml:space="preserve">3.4. 모바일 전용 사용자 인터페이스(UI) 정책</w:t>
+      </w:r>
+    </w:p>
+    <w:p>
+      <w:pPr>
+        <w:pStyle w:val="ListParagraph"/>
+        <w:numPr>
+          <w:ilvl w:val="0"/>
+          <w:numId w:val="1"/>
+        </w:numPr>
+        <w:spacing w:after="60"/>
+      </w:pPr>
+      <w:r>
+        <w:t xml:space="preserve">**모바일 첫 진입 지도 시야 최적화 정책**:</w:t>
+      </w:r>
+    </w:p>
+    <w:p>
+      <w:pPr>
+        <w:pStyle w:val="ListParagraph"/>
+        <w:numPr>
+          <w:ilvl w:val="0"/>
+          <w:numId w:val="1"/>
+        </w:numPr>
+        <w:spacing w:after="60"/>
+      </w:pPr>
+      <w:r>
+        <w:t xml:space="preserve">모바일 첫 진입 시 하단 서랍형 바텀시트에 의해 남부 지방이나 제주도가 가려지지 않도록 초기 지도 축척을 넓게 조정하고 중심점을 남쪽으로 보정하여, 사용자가 조작하지 않아도 한반도 전역의 주요 축제가 첫 화면에 시원하게 들어오도록 함.</w:t>
+      </w:r>
+    </w:p>
+    <w:p>
+      <w:pPr>
+        <w:pStyle w:val="ListParagraph"/>
+        <w:numPr>
+          <w:ilvl w:val="0"/>
+          <w:numId w:val="1"/>
+        </w:numPr>
+        <w:spacing w:after="60"/>
+      </w:pPr>
+      <w:r>
+        <w:t xml:space="preserve">**서랍형 바텀시트 인터랙션**:</w:t>
+      </w:r>
+    </w:p>
+    <w:p>
+      <w:pPr>
+        <w:pStyle w:val="ListParagraph"/>
+        <w:numPr>
+          <w:ilvl w:val="0"/>
+          <w:numId w:val="1"/>
+        </w:numPr>
+        <w:spacing w:after="60"/>
+      </w:pPr>
+      <w:r>
+        <w:t xml:space="preserve">**접힘 상태**: 지도 시야를 극대화하기 위해 검색창 영역만 하단에 콤팩트하게 노출.</w:t>
+      </w:r>
+    </w:p>
+    <w:p>
+      <w:pPr>
+        <w:pStyle w:val="ListParagraph"/>
+        <w:numPr>
+          <w:ilvl w:val="0"/>
+          <w:numId w:val="1"/>
+        </w:numPr>
+        <w:spacing w:after="60"/>
+      </w:pPr>
+      <w:r>
+        <w:t xml:space="preserve">**펼침 상태**: 중앙 핸들바를 위로 밀어 올리거나 검색창을 터치하면 화면 대부분을 덮는 풀스크린 형태로 부드럽게 확장되어 추천 배너, 필터, 축제 목록을 탐색할 수 있도록 함.</w:t>
+      </w:r>
+    </w:p>
+    <w:p>
+      <w:pPr>
+        <w:pStyle w:val="ListParagraph"/>
+        <w:numPr>
+          <w:ilvl w:val="0"/>
+          <w:numId w:val="1"/>
+        </w:numPr>
+        <w:spacing w:after="60"/>
+      </w:pPr>
+      <w:r>
+        <w:t xml:space="preserve">**스크롤 제스처 분리**: 목록 스크롤이 맨 위에 닿은 상태에서만 바텀시트를 아래로 닫을 수 있도록 제스처를 분리하여 사용성을 보호함.</w:t>
+      </w:r>
+    </w:p>
+    <w:p>
+      <w:pPr>
+        <w:pStyle w:val="ListParagraph"/>
+        <w:numPr>
+          <w:ilvl w:val="0"/>
+          <w:numId w:val="1"/>
+        </w:numPr>
+        <w:spacing w:after="60"/>
+      </w:pPr>
+      <w:r>
+        <w:t xml:space="preserve">**모바일 상세화면 인터랙션**:</w:t>
+      </w:r>
+    </w:p>
+    <w:p>
+      <w:pPr>
+        <w:pStyle w:val="ListParagraph"/>
+        <w:numPr>
+          <w:ilvl w:val="0"/>
+          <w:numId w:val="1"/>
+        </w:numPr>
+        <w:spacing w:after="60"/>
+      </w:pPr>
+      <w:r>
+        <w:t xml:space="preserve">모바일에서 축제 선택 시 전체 화면을 시원하게 채우는 풀사이즈 시트로 전환되며, 핸들바를 아래로 쓸어내려 손쉽게 닫고 이전 탐색 화면으로 복귀 가능함.</w:t>
+      </w:r>
+    </w:p>
+    <w:p>
+      <w:pPr>
+        <w:spacing w:after="100"/>
+      </w:pPr>
+      <w:r>
+        <w:t xml:space="preserve">---</w:t>
+      </w:r>
+    </w:p>
+    <w:p>
+      <w:pPr>
+        <w:pStyle w:val="Heading1"/>
+        <w:spacing w:after="100" w:before="200"/>
+      </w:pPr>
+      <w:r>
+        <w:t xml:space="preserve">4. 축제 상세 화면 구성 사양</w:t>
       </w:r>
     </w:p>
     <w:p>
@@ -834,111 +1140,438 @@
         <w:spacing w:after="80" w:before="160"/>
       </w:pPr>
       <w:r>
-        <w:t xml:space="preserve">2.5. 모바일 전용 사용자 인터페이스(UI) 정책</w:t>
-      </w:r>
-    </w:p>
-    <w:p>
-      <w:pPr>
-        <w:pStyle w:val="ListParagraph"/>
-        <w:numPr>
-          <w:ilvl w:val="0"/>
-          <w:numId w:val="1"/>
-        </w:numPr>
-        <w:spacing w:after="60"/>
-      </w:pPr>
-      <w:r>
-        <w:t xml:space="preserve">**모바일 첫 진입 지도 시야 최적화 정책**:</w:t>
-      </w:r>
-    </w:p>
-    <w:p>
-      <w:pPr>
-        <w:pStyle w:val="ListParagraph"/>
-        <w:numPr>
-          <w:ilvl w:val="0"/>
-          <w:numId w:val="1"/>
-        </w:numPr>
-        <w:spacing w:after="60"/>
-      </w:pPr>
-      <w:r>
-        <w:t xml:space="preserve">모바일 첫 진입 시 하단 서랍형 바텀시트에 의해 남부 지방이나 제주도가 가려지지 않도록 초기 지도 축척을 넓게 조정하고 중심점을 남쪽으로 보정하여, 사용자가 조작하지 않아도 한반도 전역의 주요 축제가 첫 화면에 시원하게 들어오도록 함.</w:t>
-      </w:r>
-    </w:p>
-    <w:p>
-      <w:pPr>
-        <w:pStyle w:val="ListParagraph"/>
-        <w:numPr>
-          <w:ilvl w:val="0"/>
-          <w:numId w:val="1"/>
-        </w:numPr>
-        <w:spacing w:after="60"/>
-      </w:pPr>
-      <w:r>
-        <w:t xml:space="preserve">**서랍형 바텀시트 인터랙션**:</w:t>
-      </w:r>
-    </w:p>
-    <w:p>
-      <w:pPr>
-        <w:pStyle w:val="ListParagraph"/>
-        <w:numPr>
-          <w:ilvl w:val="0"/>
-          <w:numId w:val="1"/>
-        </w:numPr>
-        <w:spacing w:after="60"/>
-      </w:pPr>
-      <w:r>
-        <w:t xml:space="preserve">**접힘 상태**: 지도 시야를 극대화하기 위해 검색창 영역만 하단에 콤팩트하게 노출.</w:t>
-      </w:r>
-    </w:p>
-    <w:p>
-      <w:pPr>
-        <w:pStyle w:val="ListParagraph"/>
-        <w:numPr>
-          <w:ilvl w:val="0"/>
-          <w:numId w:val="1"/>
-        </w:numPr>
-        <w:spacing w:after="60"/>
-      </w:pPr>
-      <w:r>
-        <w:t xml:space="preserve">**펼침 상태**: 중앙 핸들바를 위로 밀어 올리거나 검색창을 터치하면 화면 대부분을 덮는 풀스크린 형태로 부드럽게 확장되어 추천 배너, 필터, 축제 목록을 탐색할 수 있도록 함.</w:t>
-      </w:r>
-    </w:p>
-    <w:p>
-      <w:pPr>
-        <w:pStyle w:val="ListParagraph"/>
-        <w:numPr>
-          <w:ilvl w:val="0"/>
-          <w:numId w:val="1"/>
-        </w:numPr>
-        <w:spacing w:after="60"/>
-      </w:pPr>
-      <w:r>
-        <w:t xml:space="preserve">**스크롤 제스처 분리**: 목록 스크롤이 맨 위에 닿은 상태에서만 바텀시트를 아래로 닫을 수 있도록 제스처를 분리하여 사용성을 보호함.</w:t>
-      </w:r>
-    </w:p>
-    <w:p>
-      <w:pPr>
-        <w:pStyle w:val="ListParagraph"/>
-        <w:numPr>
-          <w:ilvl w:val="0"/>
-          <w:numId w:val="1"/>
-        </w:numPr>
-        <w:spacing w:after="60"/>
-      </w:pPr>
-      <w:r>
-        <w:t xml:space="preserve">**모바일 상세화면 인터랙션**:</w:t>
-      </w:r>
-    </w:p>
-    <w:p>
-      <w:pPr>
-        <w:pStyle w:val="ListParagraph"/>
-        <w:numPr>
-          <w:ilvl w:val="0"/>
-          <w:numId w:val="1"/>
-        </w:numPr>
-        <w:spacing w:after="60"/>
-      </w:pPr>
-      <w:r>
-        <w:t xml:space="preserve">모바일에서 축제 선택 시 전체 화면을 시원하게 채우는 풀사이즈 시트로 전환되며, 핸들바를 아래로 쓸어내려 손쉽게 닫고 이전 탐색 화면으로 복귀 가능함.</w:t>
+        <w:t xml:space="preserve">4.1. 노출 및 내비게이션 정책</w:t>
+      </w:r>
+    </w:p>
+    <w:p>
+      <w:pPr>
+        <w:pStyle w:val="ListParagraph"/>
+        <w:numPr>
+          <w:ilvl w:val="0"/>
+          <w:numId w:val="1"/>
+        </w:numPr>
+        <w:spacing w:after="60"/>
+      </w:pPr>
+      <w:r>
+        <w:t xml:space="preserve">**노출 시점**: 목록 카드 클릭 또는 지도 상의 개별 마커 클릭 시 즉시 노출.</w:t>
+      </w:r>
+    </w:p>
+    <w:p>
+      <w:pPr>
+        <w:pStyle w:val="ListParagraph"/>
+        <w:numPr>
+          <w:ilvl w:val="0"/>
+          <w:numId w:val="1"/>
+        </w:numPr>
+        <w:spacing w:after="60"/>
+      </w:pPr>
+      <w:r>
+        <w:t xml:space="preserve">**배치 형태**: PC에서는 좌측 검색 패널 우측에 나란히 플로팅 노출되며, 모바일에서는 화면을 채우는 바텀시트 모달로 노출됨.</w:t>
+      </w:r>
+    </w:p>
+    <w:p>
+      <w:pPr>
+        <w:pStyle w:val="ListParagraph"/>
+        <w:numPr>
+          <w:ilvl w:val="0"/>
+          <w:numId w:val="1"/>
+        </w:numPr>
+        <w:spacing w:after="60"/>
+      </w:pPr>
+      <w:r>
+        <w:t xml:space="preserve">**스크롤 위치 초기화 정책**: 상세 패널이 열려 있는 상태에서 다른 축제를 연속으로 선택하더라도, 이전 축제의 스크롤 잔류 없이 항상 상세 화면의 맨 위부터 표시되도록 함.</w:t>
+      </w:r>
+    </w:p>
+    <w:p>
+      <w:pPr>
+        <w:pStyle w:val="ListParagraph"/>
+        <w:numPr>
+          <w:ilvl w:val="0"/>
+          <w:numId w:val="1"/>
+        </w:numPr>
+        <w:spacing w:after="60"/>
+      </w:pPr>
+      <w:r>
+        <w:t xml:space="preserve">**상단 내비게이션 및 공유**:</w:t>
+      </w:r>
+    </w:p>
+    <w:p>
+      <w:pPr>
+        <w:pStyle w:val="ListParagraph"/>
+        <w:numPr>
+          <w:ilvl w:val="0"/>
+          <w:numId w:val="1"/>
+        </w:numPr>
+        <w:spacing w:after="60"/>
+      </w:pPr>
+      <w:r>
+        <w:t xml:space="preserve">**닫기(X) 버튼**: 패널을 닫고 이전 지도/목록 탐색 상태로 복귀.</w:t>
+      </w:r>
+    </w:p>
+    <w:p>
+      <w:pPr>
+        <w:pStyle w:val="ListParagraph"/>
+        <w:numPr>
+          <w:ilvl w:val="0"/>
+          <w:numId w:val="1"/>
+        </w:numPr>
+        <w:spacing w:after="60"/>
+      </w:pPr>
+      <w:r>
+        <w:t xml:space="preserve">**공유하기 버튼**: 현재 축제 상세 페이지 접속 URL을 클립보드에 복사하고 안내 토스트를 표출함.</w:t>
+      </w:r>
+    </w:p>
+    <w:p>
+      <w:pPr>
+        <w:pStyle w:val="Heading2"/>
+        <w:spacing w:after="80" w:before="160"/>
+      </w:pPr>
+      <w:r>
+        <w:t xml:space="preserve">4.2. 상단 비주얼 영역 (대표 포스터)</w:t>
+      </w:r>
+    </w:p>
+    <w:p>
+      <w:pPr>
+        <w:pStyle w:val="ListParagraph"/>
+        <w:numPr>
+          <w:ilvl w:val="0"/>
+          <w:numId w:val="1"/>
+        </w:numPr>
+        <w:spacing w:after="60"/>
+      </w:pPr>
+      <w:r>
+        <w:t xml:space="preserve">포스터 원본 비율을 보존하여 상하 잘림 없이 온전하게 노출하며, 좌우 여백 영역을 자연스럽게 배경 마감 처리함.</w:t>
+      </w:r>
+    </w:p>
+    <w:p>
+      <w:pPr>
+        <w:pStyle w:val="ListParagraph"/>
+        <w:numPr>
+          <w:ilvl w:val="0"/>
+          <w:numId w:val="1"/>
+        </w:numPr>
+        <w:spacing w:after="60"/>
+      </w:pPr>
+      <w:r>
+        <w:t xml:space="preserve">포스터 클릭 시 화면 전체를 활용한 라이트박스 확대 뷰어를 제공함.</w:t>
+      </w:r>
+    </w:p>
+    <w:p>
+      <w:pPr>
+        <w:pStyle w:val="Heading2"/>
+        <w:spacing w:after="80" w:before="160"/>
+      </w:pPr>
+      <w:r>
+        <w:t xml:space="preserve">4.3. 기본 정보 및 핵심 메타 정보 영역</w:t>
+      </w:r>
+    </w:p>
+    <w:p>
+      <w:pPr>
+        <w:pStyle w:val="ListParagraph"/>
+        <w:numPr>
+          <w:ilvl w:val="0"/>
+          <w:numId w:val="1"/>
+        </w:numPr>
+        <w:spacing w:after="60"/>
+      </w:pPr>
+      <w:r>
+        <w:t xml:space="preserve">**진행 상태 뱃지**: `진행중`, `D-Day / D-N(진행 예정)`, `종료`로 구분 노출.</w:t>
+      </w:r>
+    </w:p>
+    <w:p>
+      <w:pPr>
+        <w:pStyle w:val="ListParagraph"/>
+        <w:numPr>
+          <w:ilvl w:val="0"/>
+          <w:numId w:val="1"/>
+        </w:numPr>
+        <w:spacing w:after="60"/>
+      </w:pPr>
+      <w:r>
+        <w:t xml:space="preserve">**축제명**: 축제 공식 명칭을 강조 표기.</w:t>
+      </w:r>
+    </w:p>
+    <w:p>
+      <w:pPr>
+        <w:pStyle w:val="ListParagraph"/>
+        <w:numPr>
+          <w:ilvl w:val="0"/>
+          <w:numId w:val="1"/>
+        </w:numPr>
+        <w:spacing w:after="60"/>
+      </w:pPr>
+      <w:r>
+        <w:t xml:space="preserve">**행사 기간**: 시작일 및 종료일을 명확히 표기.</w:t>
+      </w:r>
+    </w:p>
+    <w:p>
+      <w:pPr>
+        <w:pStyle w:val="ListParagraph"/>
+        <w:numPr>
+          <w:ilvl w:val="0"/>
+          <w:numId w:val="1"/>
+        </w:numPr>
+        <w:spacing w:after="60"/>
+      </w:pPr>
+      <w:r>
+        <w:t xml:space="preserve">**개최 장소**: 도로명 주소를 기본 표기하며 지번 주소를 보조 표기함.</w:t>
+      </w:r>
+    </w:p>
+    <w:p>
+      <w:pPr>
+        <w:pStyle w:val="ListParagraph"/>
+        <w:numPr>
+          <w:ilvl w:val="0"/>
+          <w:numId w:val="1"/>
+        </w:numPr>
+        <w:spacing w:after="60"/>
+      </w:pPr>
+      <w:r>
+        <w:t xml:space="preserve">**운영 시간**: 축제 운영 및 관람 시간 정보 표출.</w:t>
+      </w:r>
+    </w:p>
+    <w:p>
+      <w:pPr>
+        <w:pStyle w:val="ListParagraph"/>
+        <w:numPr>
+          <w:ilvl w:val="0"/>
+          <w:numId w:val="1"/>
+        </w:numPr>
+        <w:spacing w:after="60"/>
+      </w:pPr>
+      <w:r>
+        <w:t xml:space="preserve">**이용 요금**: 무료 또는 유료 세부 요금 정보를 표출함.</w:t>
+      </w:r>
+    </w:p>
+    <w:p>
+      <w:pPr>
+        <w:pStyle w:val="ListParagraph"/>
+        <w:numPr>
+          <w:ilvl w:val="0"/>
+          <w:numId w:val="1"/>
+        </w:numPr>
+        <w:spacing w:after="60"/>
+      </w:pPr>
+      <w:r>
+        <w:t xml:space="preserve">**문의처**: 대표 전화번호를 표기하고 모바일 환경에서 터치 시 즉시 전화 걸기(`tel:`) 기능을 지원함.</w:t>
+      </w:r>
+    </w:p>
+    <w:p>
+      <w:pPr>
+        <w:pStyle w:val="Heading2"/>
+        <w:spacing w:after="80" w:before="160"/>
+      </w:pPr>
+      <w:r>
+        <w:t xml:space="preserve">4.4. 길찾기 연동</w:t>
+      </w:r>
+    </w:p>
+    <w:p>
+      <w:pPr>
+        <w:pStyle w:val="ListParagraph"/>
+        <w:numPr>
+          <w:ilvl w:val="0"/>
+          <w:numId w:val="1"/>
+        </w:numPr>
+        <w:spacing w:after="60"/>
+      </w:pPr>
+      <w:r>
+        <w:t xml:space="preserve">축제 행사장 위치로 즉시 길 안내를 받을 수 있도록 네이버지도 및 카카오맵 길찾기 바로가기 아웃링크 버튼을 제공함.</w:t>
+      </w:r>
+    </w:p>
+    <w:p>
+      <w:pPr>
+        <w:pStyle w:val="Heading2"/>
+        <w:spacing w:after="80" w:before="160"/>
+      </w:pPr>
+      <w:r>
+        <w:t xml:space="preserve">4.5. 축제 소개 및 행사 프로그램 모듈 (모듈 유지 정책)</w:t>
+      </w:r>
+    </w:p>
+    <w:p>
+      <w:pPr>
+        <w:pStyle w:val="ListParagraph"/>
+        <w:numPr>
+          <w:ilvl w:val="0"/>
+          <w:numId w:val="1"/>
+        </w:numPr>
+        <w:spacing w:after="60"/>
+      </w:pPr>
+      <w:r>
+        <w:t xml:space="preserve">**축제 소개 모듈**:</w:t>
+      </w:r>
+    </w:p>
+    <w:p>
+      <w:pPr>
+        <w:pStyle w:val="ListParagraph"/>
+        <w:numPr>
+          <w:ilvl w:val="0"/>
+          <w:numId w:val="1"/>
+        </w:numPr>
+        <w:spacing w:after="60"/>
+      </w:pPr>
+      <w:r>
+        <w:t xml:space="preserve">축제 개요 및 상세 취지 소개글 표출.</w:t>
+      </w:r>
+    </w:p>
+    <w:p>
+      <w:pPr>
+        <w:pStyle w:val="ListParagraph"/>
+        <w:numPr>
+          <w:ilvl w:val="0"/>
+          <w:numId w:val="1"/>
+        </w:numPr>
+        <w:spacing w:after="60"/>
+      </w:pPr>
+      <w:r>
+        <w:t xml:space="preserve">**데이터 부재 시 정책**: 등록된 소개 데이터가 없는 경우에도 모듈 박스 영역을 유지하며, `"상세 축제 소개 정보가 준비 중입니다."` 안내 문구를 표출함.</w:t>
+      </w:r>
+    </w:p>
+    <w:p>
+      <w:pPr>
+        <w:pStyle w:val="ListParagraph"/>
+        <w:numPr>
+          <w:ilvl w:val="0"/>
+          <w:numId w:val="1"/>
+        </w:numPr>
+        <w:spacing w:after="60"/>
+      </w:pPr>
+      <w:r>
+        <w:t xml:space="preserve">**주요 행사 프로그램 모듈**:</w:t>
+      </w:r>
+    </w:p>
+    <w:p>
+      <w:pPr>
+        <w:pStyle w:val="ListParagraph"/>
+        <w:numPr>
+          <w:ilvl w:val="0"/>
+          <w:numId w:val="1"/>
+        </w:numPr>
+        <w:spacing w:after="60"/>
+      </w:pPr>
+      <w:r>
+        <w:t xml:space="preserve">주요 공연, 퍼레이드, 무대 행사 등 일정표 데이터 표출.</w:t>
+      </w:r>
+    </w:p>
+    <w:p>
+      <w:pPr>
+        <w:pStyle w:val="ListParagraph"/>
+        <w:numPr>
+          <w:ilvl w:val="0"/>
+          <w:numId w:val="1"/>
+        </w:numPr>
+        <w:spacing w:after="60"/>
+      </w:pPr>
+      <w:r>
+        <w:t xml:space="preserve">**데이터 부재 시 정책**: 등록된 프로그램 데이터가 없는 경우에도 모듈 박스 영역을 유지하며, `"등록된 주요 행사 프로그램 정보가 없습니다. 상세 일정은 공식 홈페이지를 참고해주세요."` 안내 문구를 표출함.</w:t>
+      </w:r>
+    </w:p>
+    <w:p>
+      <w:pPr>
+        <w:pStyle w:val="ListParagraph"/>
+        <w:numPr>
+          <w:ilvl w:val="0"/>
+          <w:numId w:val="1"/>
+        </w:numPr>
+        <w:spacing w:after="60"/>
+      </w:pPr>
+      <w:r>
+        <w:t xml:space="preserve">**부대행사 및 특별 프로그램 모듈**:</w:t>
+      </w:r>
+    </w:p>
+    <w:p>
+      <w:pPr>
+        <w:pStyle w:val="ListParagraph"/>
+        <w:numPr>
+          <w:ilvl w:val="0"/>
+          <w:numId w:val="1"/>
+        </w:numPr>
+        <w:spacing w:after="60"/>
+      </w:pPr>
+      <w:r>
+        <w:t xml:space="preserve">상설 체험 부스, 부대행사 안내 텍스트 표출.</w:t>
+      </w:r>
+    </w:p>
+    <w:p>
+      <w:pPr>
+        <w:pStyle w:val="ListParagraph"/>
+        <w:numPr>
+          <w:ilvl w:val="0"/>
+          <w:numId w:val="1"/>
+        </w:numPr>
+        <w:spacing w:after="60"/>
+      </w:pPr>
+      <w:r>
+        <w:t xml:space="preserve">**데이터 부재 시 정책**: 등록된 부대행사 데이터가 없는 경우에도 모듈 박스 영역을 유지하며, `"등록된 부대행사 및 특별 프로그램 정보가 없습니다."` 안내 문구를 표출함.</w:t>
+      </w:r>
+    </w:p>
+    <w:p>
+      <w:pPr>
+        <w:pStyle w:val="Heading2"/>
+        <w:spacing w:after="80" w:before="160"/>
+      </w:pPr>
+      <w:r>
+        <w:t xml:space="preserve">4.6. 현장 갤러리 피드</w:t>
+      </w:r>
+    </w:p>
+    <w:p>
+      <w:pPr>
+        <w:pStyle w:val="ListParagraph"/>
+        <w:numPr>
+          <w:ilvl w:val="0"/>
+          <w:numId w:val="1"/>
+        </w:numPr>
+        <w:spacing w:after="60"/>
+      </w:pPr>
+      <w:r>
+        <w:t xml:space="preserve">한국관광공사 TourAPI의 서브 이미지 데이터를 연동하여 사진 목록을 표출함.</w:t>
+      </w:r>
+    </w:p>
+    <w:p>
+      <w:pPr>
+        <w:pStyle w:val="ListParagraph"/>
+        <w:numPr>
+          <w:ilvl w:val="0"/>
+          <w:numId w:val="1"/>
+        </w:numPr>
+        <w:spacing w:after="60"/>
+      </w:pPr>
+      <w:r>
+        <w:t xml:space="preserve">타일 형태 대신 아래로 스크롤하며 시원하게 감상할 수 있는 1열 피드 형태로 사진을 배치함.</w:t>
+      </w:r>
+    </w:p>
+    <w:p>
+      <w:pPr>
+        <w:pStyle w:val="ListParagraph"/>
+        <w:numPr>
+          <w:ilvl w:val="0"/>
+          <w:numId w:val="1"/>
+        </w:numPr>
+        <w:spacing w:after="60"/>
+      </w:pPr>
+      <w:r>
+        <w:t xml:space="preserve">사진 터치 시 전체 화면 확대 뷰어를 제공하며 이전/다음 사진 탐색 기능을 지원함.</w:t>
+      </w:r>
+    </w:p>
+    <w:p>
+      <w:pPr>
+        <w:pStyle w:val="Heading2"/>
+        <w:spacing w:after="80" w:before="160"/>
+      </w:pPr>
+      <w:r>
+        <w:t xml:space="preserve">4.7. 공식 홈페이지 바로가기</w:t>
+      </w:r>
+    </w:p>
+    <w:p>
+      <w:pPr>
+        <w:pStyle w:val="ListParagraph"/>
+        <w:numPr>
+          <w:ilvl w:val="0"/>
+          <w:numId w:val="1"/>
+        </w:numPr>
+        <w:spacing w:after="60"/>
+      </w:pPr>
+      <w:r>
+        <w:t xml:space="preserve">공식 웹사이트 주소 데이터가 존재하는 경우 외부 새 창으로 안전하게 연결되는 버튼을 제공함.</w:t>
       </w:r>
     </w:p>
     <w:p>
@@ -955,7 +1588,7 @@
         <w:spacing w:after="100" w:before="200"/>
       </w:pPr>
       <w:r>
-        <w:t xml:space="preserve">3. 기능 및 데이터 연동 정책</w:t>
+        <w:t xml:space="preserve">5. 기능 및 데이터 연동 정책</w:t>
       </w:r>
     </w:p>
     <w:p>
@@ -964,7 +1597,7 @@
         <w:spacing w:after="80" w:before="160"/>
       </w:pPr>
       <w:r>
-        <w:t xml:space="preserve">3.1. 기본 진입 화면 및 테마 검색 연동</w:t>
+        <w:t xml:space="preserve">5.1. 기본 진입 화면 및 테마 검색 연동</w:t>
       </w:r>
     </w:p>
     <w:p>
@@ -1038,7 +1671,7 @@
         <w:spacing w:after="80" w:before="160"/>
       </w:pPr>
       <w:r>
-        <w:t xml:space="preserve">3.2. 상태 필터 및 종료 축제 조회 제한</w:t>
+        <w:t xml:space="preserve">5.2. 상태 필터 및 종료 축제 조회 제한 정책</w:t>
       </w:r>
     </w:p>
     <w:p>
@@ -1099,7 +1732,7 @@
         <w:spacing w:after="80" w:before="160"/>
       </w:pPr>
       <w:r>
-        <w:t xml:space="preserve">3.3. 지도-목록 연동 및 카메라 이동 정책</w:t>
+        <w:t xml:space="preserve">5.3. 지도-목록 연동 및 카메라 이동 정책</w:t>
       </w:r>
     </w:p>
     <w:p>
@@ -1142,7 +1775,186 @@
         <w:spacing w:after="100" w:before="200"/>
       </w:pPr>
       <w:r>
-        <w:t xml:space="preserve">4. 예외 상황 처리 및 사용자 안내 정책</w:t>
+        <w:t xml:space="preserve">6. 운영 관리자 화면 및 정책</w:t>
+      </w:r>
+    </w:p>
+    <w:p>
+      <w:pPr>
+        <w:pStyle w:val="Heading2"/>
+        <w:spacing w:after="80" w:before="160"/>
+      </w:pPr>
+      <w:r>
+        <w:t xml:space="preserve">6.1. 관리자 개요</w:t>
+      </w:r>
+    </w:p>
+    <w:p>
+      <w:pPr>
+        <w:pStyle w:val="ListParagraph"/>
+        <w:numPr>
+          <w:ilvl w:val="0"/>
+          <w:numId w:val="1"/>
+        </w:numPr>
+        <w:spacing w:after="60"/>
+      </w:pPr>
+      <w:r>
+        <w:t xml:space="preserve">등록된 축제 데이터의 노출 상태를 제어하고, 공공 API에 미반영된 축제를 수동 등록할 수 있는 자체 운영 관리자 화면(`/admin`)을 제공함.</w:t>
+      </w:r>
+    </w:p>
+    <w:p>
+      <w:pPr>
+        <w:pStyle w:val="Heading2"/>
+        <w:spacing w:after="80" w:before="160"/>
+      </w:pPr>
+      <w:r>
+        <w:t xml:space="preserve">6.2. 축제 목록 관리 및 공개 상태 제어</w:t>
+      </w:r>
+    </w:p>
+    <w:p>
+      <w:pPr>
+        <w:pStyle w:val="ListParagraph"/>
+        <w:numPr>
+          <w:ilvl w:val="0"/>
+          <w:numId w:val="1"/>
+        </w:numPr>
+        <w:spacing w:after="60"/>
+      </w:pPr>
+      <w:r>
+        <w:t xml:space="preserve">**목록 항목**: 식별번호(ID), 축제명, 개최 기간, 개최 지역, 데이터 출처(공공 API 수집 / 수동 등록), 노출 상태.</w:t>
+      </w:r>
+    </w:p>
+    <w:p>
+      <w:pPr>
+        <w:pStyle w:val="ListParagraph"/>
+        <w:numPr>
+          <w:ilvl w:val="0"/>
+          <w:numId w:val="1"/>
+        </w:numPr>
+        <w:spacing w:after="60"/>
+      </w:pPr>
+      <w:r>
+        <w:t xml:space="preserve">**공개/숨김 상태 제어**:</w:t>
+      </w:r>
+    </w:p>
+    <w:p>
+      <w:pPr>
+        <w:pStyle w:val="ListParagraph"/>
+        <w:numPr>
+          <w:ilvl w:val="0"/>
+          <w:numId w:val="1"/>
+        </w:numPr>
+        <w:spacing w:after="60"/>
+      </w:pPr>
+      <w:r>
+        <w:t xml:space="preserve">축제별로 즉시 공개/숨김 상태를 전환할 수 있는 토글 스위치 제공.</w:t>
+      </w:r>
+    </w:p>
+    <w:p>
+      <w:pPr>
+        <w:pStyle w:val="ListParagraph"/>
+        <w:numPr>
+          <w:ilvl w:val="0"/>
+          <w:numId w:val="1"/>
+        </w:numPr>
+        <w:spacing w:after="60"/>
+      </w:pPr>
+      <w:r>
+        <w:t xml:space="preserve">운영자가 '숨김' 처리한 축제는 사용자 화면(지도 마커, 검색 결과, 테마 큐레이션)에서 즉시 실시간 제외됨.</w:t>
+      </w:r>
+    </w:p>
+    <w:p>
+      <w:pPr>
+        <w:pStyle w:val="Heading2"/>
+        <w:spacing w:after="80" w:before="160"/>
+      </w:pPr>
+      <w:r>
+        <w:t xml:space="preserve">6.3. 신규 축제 수동 등록</w:t>
+      </w:r>
+    </w:p>
+    <w:p>
+      <w:pPr>
+        <w:pStyle w:val="ListParagraph"/>
+        <w:numPr>
+          <w:ilvl w:val="0"/>
+          <w:numId w:val="1"/>
+        </w:numPr>
+        <w:spacing w:after="60"/>
+      </w:pPr>
+      <w:r>
+        <w:t xml:space="preserve">공공 API에 아직 등재되지 않았거나 긴급 등록이 필요한 주요 축제를 위해 관리자 직접 입력 양식을 제공함.</w:t>
+      </w:r>
+    </w:p>
+    <w:p>
+      <w:pPr>
+        <w:pStyle w:val="ListParagraph"/>
+        <w:numPr>
+          <w:ilvl w:val="0"/>
+          <w:numId w:val="1"/>
+        </w:numPr>
+        <w:spacing w:after="60"/>
+      </w:pPr>
+      <w:r>
+        <w:t xml:space="preserve">**입력 항목**: 축제명, 행사 시작일 및 종료일, 개최 장소(주소), 지도 좌표(위경도), 대표 이미지 주소, 이용 요금, 운영 시간, 상세 소개글, 문의처 전화번호, 홈페이지 주소.</w:t>
+      </w:r>
+    </w:p>
+    <w:p>
+      <w:pPr>
+        <w:spacing w:after="100"/>
+      </w:pPr>
+      <w:r>
+        <w:t xml:space="preserve">---</w:t>
+      </w:r>
+    </w:p>
+    <w:p>
+      <w:pPr>
+        <w:pStyle w:val="Heading1"/>
+        <w:spacing w:after="100" w:before="200"/>
+      </w:pPr>
+      <w:r>
+        <w:t xml:space="preserve">7. 시스템 및 예외 처리 정책</w:t>
+      </w:r>
+    </w:p>
+    <w:p>
+      <w:pPr>
+        <w:pStyle w:val="Heading2"/>
+        <w:spacing w:after="80" w:before="160"/>
+      </w:pPr>
+      <w:r>
+        <w:t xml:space="preserve">7.1. 시스템 및 데이터 수집 정책</w:t>
+      </w:r>
+    </w:p>
+    <w:p>
+      <w:pPr>
+        <w:pStyle w:val="ListParagraph"/>
+        <w:numPr>
+          <w:ilvl w:val="0"/>
+          <w:numId w:val="1"/>
+        </w:numPr>
+        <w:spacing w:after="60"/>
+      </w:pPr>
+      <w:r>
+        <w:t xml:space="preserve">**데이터베이스 단일 풀 관리**: 데이터베이스 연결 자원을 효율적으로 관리하기 위해 연결 인스턴스를 재사용함.</w:t>
+      </w:r>
+    </w:p>
+    <w:p>
+      <w:pPr>
+        <w:pStyle w:val="ListParagraph"/>
+        <w:numPr>
+          <w:ilvl w:val="0"/>
+          <w:numId w:val="1"/>
+        </w:numPr>
+        <w:spacing w:after="60"/>
+      </w:pPr>
+      <w:r>
+        <w:t xml:space="preserve">**외부 API 장애 격리**: 공공 API 서버 장애 시에도 서비스가 중단되지 않도록 사전에 자체 DB로 적재된 정기 동기화 데이터를 기반으로 서비스함.</w:t>
+      </w:r>
+    </w:p>
+    <w:p>
+      <w:pPr>
+        <w:pStyle w:val="Heading2"/>
+        <w:spacing w:after="80" w:before="160"/>
+      </w:pPr>
+      <w:r>
+        <w:t xml:space="preserve">7.2. 예외 상황 처리 및 사용자 안내 정책</w:t>
       </w:r>
     </w:p>
     <w:p>
@@ -1176,49 +1988,70 @@
         <w:spacing w:after="60"/>
       </w:pPr>
       <w:r>
-        <w:t xml:space="preserve">조치 권유: 검색어 초기화 또는 다른 추천 테마 클릭 유도.</w:t>
-      </w:r>
-    </w:p>
-    <w:p>
-      <w:pPr>
-        <w:spacing w:after="100"/>
-      </w:pPr>
-      <w:r>
-        <w:t xml:space="preserve">2. **위치 권한 거부 시**:</w:t>
-      </w:r>
-    </w:p>
-    <w:p>
-      <w:pPr>
-        <w:pStyle w:val="ListParagraph"/>
-        <w:numPr>
-          <w:ilvl w:val="0"/>
-          <w:numId w:val="1"/>
-        </w:numPr>
-        <w:spacing w:after="60"/>
-      </w:pPr>
-      <w:r>
-        <w:t xml:space="preserve">안내 문구: "위치 정보를 가져올 수 없습니다. 브라우저 위치 권한을 확인해주세요." 안내 후 기본 전국 화면 유지.</w:t>
-      </w:r>
-    </w:p>
-    <w:p>
-      <w:pPr>
-        <w:spacing w:after="100"/>
-      </w:pPr>
-      <w:r>
-        <w:t xml:space="preserve">3. **이미지 미등록 또는 깨짐 발생 시**:</w:t>
-      </w:r>
-    </w:p>
-    <w:p>
-      <w:pPr>
-        <w:pStyle w:val="ListParagraph"/>
-        <w:numPr>
-          <w:ilvl w:val="0"/>
-          <w:numId w:val="1"/>
-        </w:numPr>
-        <w:spacing w:after="60"/>
-      </w:pPr>
-      <w:r>
-        <w:t xml:space="preserve">빈 엑스박스 대신 서비스 전용 기본 그래픽 이미지를 대체 노출함.</w:t>
+        <w:t xml:space="preserve">조치 권유: 검색어 초기화(X) 또는 다른 추천 테마 클릭 유도.</w:t>
+      </w:r>
+    </w:p>
+    <w:p>
+      <w:pPr>
+        <w:spacing w:after="100"/>
+      </w:pPr>
+      <w:r>
+        <w:t xml:space="preserve">2. **존재하지 않거나 삭제된 축제 접근 시**:</w:t>
+      </w:r>
+    </w:p>
+    <w:p>
+      <w:pPr>
+        <w:pStyle w:val="ListParagraph"/>
+        <w:numPr>
+          <w:ilvl w:val="0"/>
+          <w:numId w:val="1"/>
+        </w:numPr>
+        <w:spacing w:after="60"/>
+      </w:pPr>
+      <w:r>
+        <w:t xml:space="preserve">URL 파라미터(`festivalId`)로 전달된 축제가 DB에 없거나 숨김 처리된 경우, 오류 화면 대신 주소창을 정리하고 기본 전체 지도 뷰로 부드럽게 유도함.</w:t>
+      </w:r>
+    </w:p>
+    <w:p>
+      <w:pPr>
+        <w:spacing w:after="100"/>
+      </w:pPr>
+      <w:r>
+        <w:t xml:space="preserve">3. **위치 권한 거부 시**:</w:t>
+      </w:r>
+    </w:p>
+    <w:p>
+      <w:pPr>
+        <w:pStyle w:val="ListParagraph"/>
+        <w:numPr>
+          <w:ilvl w:val="0"/>
+          <w:numId w:val="1"/>
+        </w:numPr>
+        <w:spacing w:after="60"/>
+      </w:pPr>
+      <w:r>
+        <w:t xml:space="preserve">안내 문구: "위치 정보를 가져올 수 없습니다. 브라우저 위치 권한을 확인해주세요." 토스트 안내 후 기본 전국 화면 유지.</w:t>
+      </w:r>
+    </w:p>
+    <w:p>
+      <w:pPr>
+        <w:spacing w:after="100"/>
+      </w:pPr>
+      <w:r>
+        <w:t xml:space="preserve">4. **이미지 미등록 또는 깨짐 발생 시**:</w:t>
+      </w:r>
+    </w:p>
+    <w:p>
+      <w:pPr>
+        <w:pStyle w:val="ListParagraph"/>
+        <w:numPr>
+          <w:ilvl w:val="0"/>
+          <w:numId w:val="1"/>
+        </w:numPr>
+        <w:spacing w:after="60"/>
+      </w:pPr>
+      <w:r>
+        <w:t xml:space="preserve">빈 엑스박스 아이콘 대신 서비스 전용 기본 그래픽 이미지를 대체 노출함.</w:t>
       </w:r>
     </w:p>
     <w:sectPr>

</xml_diff>

<commit_message>
revert: remove Hankyung Travel PICK default selection on initial entry, return to nationwide ongoing festivals
</commit_message>
<xml_diff>
--- a/public/festival_service_spec.docx
+++ b/public/festival_service_spec.docx
@@ -290,7 +290,7 @@
         <w:spacing w:after="60"/>
       </w:pPr>
       <w:r>
-        <w:t xml:space="preserve">최초 진입 시 에디터 추천 축제(한경 트래블 PICK)가 기본 선택된 최적의 화면 상태로 로드됨.</w:t>
+        <w:t xml:space="preserve">최초 진입 시 별도의 검색어 없이 현재 '진행중'인 전국 축제 목록이 지도에 기본 로드됨.</w:t>
       </w:r>
     </w:p>
     <w:p>
@@ -1610,7 +1610,7 @@
         <w:spacing w:after="60"/>
       </w:pPr>
       <w:r>
-        <w:t xml:space="preserve">**기본 진입 상태**: 사용자가 처음 접속 시 **'한경 트래블 PICK'**이 기본 선택되어 첫 화면부터 풍부한 대표 축제 목록을 제공함.</w:t>
+        <w:t xml:space="preserve">**기본 진입 상태**: 사용자가 처음 접속 시 특정 테마가 선택되지 않은 순수 기본 상태로 로드되며, 현재 개최 중인 **'진행 중' 전국 축제**를 최우선으로 안내함. (상단 배너 클릭 시 언제든 원하는 테마로 즉시 전환 탐색 가능)</w:t>
       </w:r>
     </w:p>
     <w:p>

</xml_diff>

<commit_message>
feat: remove current map search button, maintain 100% data consistency between search panel list and map markers
</commit_message>
<xml_diff>
--- a/public/festival_service_spec.docx
+++ b/public/festival_service_spec.docx
@@ -395,7 +395,7 @@
         <w:spacing w:after="100"/>
       </w:pPr>
       <w:r>
-        <w:t xml:space="preserve">│       ├─► 전국 축제 마커 및 클러스터링(밀집 숫자) 표기</w:t>
+        <w:t xml:space="preserve">│       ├─► 전국 축제 마커 및 클러스터링(밀집 숫자) 표기 (검색 패널과 100% 동기화)</w:t>
       </w:r>
     </w:p>
     <w:p>
@@ -404,14 +404,6 @@
       </w:pPr>
       <w:r>
         <w:t xml:space="preserve">│       ├─► 내 위치 찾기 (GPS 연동 현 위치 지도 이동)</w:t>
-      </w:r>
-    </w:p>
-    <w:p>
-      <w:pPr>
-        <w:spacing w:after="100"/>
-      </w:pPr>
-      <w:r>
-        <w:t xml:space="preserve">│       ├─► 지도 직접 이동/줌 조작 ──► [현 지도에서 검색] 플로팅 버튼 노출 ──► 클릭 시 화면 내 축제 재정렬</w:t>
       </w:r>
     </w:p>
     <w:p>
@@ -718,20 +710,20 @@
         <w:spacing w:after="60"/>
       </w:pPr>
       <w:r>
-        <w:t xml:space="preserve">**마커 표기**: 축제의 진행 상태별로 마커 색상을 구분 표기하며, 밀집 지역은 숫자로 묶어 표시하는 클러스터링을 적용함.</w:t>
-      </w:r>
-    </w:p>
-    <w:p>
-      <w:pPr>
-        <w:pStyle w:val="ListParagraph"/>
-        <w:numPr>
-          <w:ilvl w:val="0"/>
-          <w:numId w:val="1"/>
-        </w:numPr>
-        <w:spacing w:after="60"/>
-      </w:pPr>
-      <w:r>
-        <w:t xml:space="preserve">**현 지도에서 검색 버튼**: 사용자가 지도를 직접 드래그하거나 확대/축소했을 때만 화면 상단에 플로팅 노출하여, 클릭 시 현재 보이는 지도 범위 내 축제만 목록에 갱신함.</w:t>
+        <w:t xml:space="preserve">**마커 표기 및 데이터 일치**: 축제의 진행 상태별로 마커 색상을 구분 표기하며, 밀집 지역은 숫자로 묶어 표시하는 클러스터링을 적용함. 지도 상의 마커는 좌측 검색/필터 패널의 목록 결과와 항상 100% 일치하도록 연동함.</w:t>
+      </w:r>
+    </w:p>
+    <w:p>
+      <w:pPr>
+        <w:pStyle w:val="ListParagraph"/>
+        <w:numPr>
+          <w:ilvl w:val="0"/>
+          <w:numId w:val="1"/>
+        </w:numPr>
+        <w:spacing w:after="60"/>
+      </w:pPr>
+      <w:r>
+        <w:t xml:space="preserve">**화면 영역 제한 배제**: 지도 이동이나 확대/축소 시 별도의 재검색 버튼('현 지도에서 검색') 없이, 검색 조건에 부합하는 모든 축제가 지도 상에 온전히 유지됨.</w:t>
       </w:r>
     </w:p>
     <w:p>
@@ -1745,20 +1737,33 @@
         <w:spacing w:after="60"/>
       </w:pPr>
       <w:r>
-        <w:t xml:space="preserve">**목록 선택 시 지도 연동**: 목록에서 특정 축제를 선택하면 해당 위치로 부드럽게 글라이딩 이동함. 이때 패널에 마커가 가려지지 않도록 시야를 고려한 중심점에 포커싱하며, 시스템 이동 시에는 '현 지도에서 검색' 버튼을 띄우지 않음.</w:t>
-      </w:r>
-    </w:p>
-    <w:p>
-      <w:pPr>
-        <w:pStyle w:val="ListParagraph"/>
-        <w:numPr>
-          <w:ilvl w:val="0"/>
-          <w:numId w:val="1"/>
-        </w:numPr>
-        <w:spacing w:after="60"/>
-      </w:pPr>
-      <w:r>
-        <w:t xml:space="preserve">**사용자 지도 조작 시 연동**: 사용자가 직접 지도를 움직이거나 줌을 변경한 경우에만 '현 지도에서 검색' 버튼을 노출하여 사용자 의도에 따라 현재 영역의 축제 목록을 갱신함.</w:t>
+        <w:t xml:space="preserve">**검색 결과와 지도 마커 100% 일치 정책**: 사용자가 검색창에 키워드를 입력하거나 진행 상태 필터를 변경하면, 검색 패널의 축제 목록과 지도 상에 표시되는 모든 마커가 완전히 동일한 데이터 집합으로 동기화됨. 지도를 이동하더라도 목록의 축제가 임의로 제외되거나 마커가 사라지지 않음.</w:t>
+      </w:r>
+    </w:p>
+    <w:p>
+      <w:pPr>
+        <w:pStyle w:val="ListParagraph"/>
+        <w:numPr>
+          <w:ilvl w:val="0"/>
+          <w:numId w:val="1"/>
+        </w:numPr>
+        <w:spacing w:after="60"/>
+      </w:pPr>
+      <w:r>
+        <w:t xml:space="preserve">**목록 선택 시 지도 연동**: 목록에서 특정 축제를 선택하면 해당 위치로 부드럽게 글라이딩 이동함. 이때 패널에 마커가 가려지지 않도록 시야를 고려한 최적 중심점에 포커싱됨.</w:t>
+      </w:r>
+    </w:p>
+    <w:p>
+      <w:pPr>
+        <w:pStyle w:val="ListParagraph"/>
+        <w:numPr>
+          <w:ilvl w:val="0"/>
+          <w:numId w:val="1"/>
+        </w:numPr>
+        <w:spacing w:after="60"/>
+      </w:pPr>
+      <w:r>
+        <w:t xml:space="preserve">**자유로운 지도 탐색 보장**: 사용자가 지도를 자유롭게 이동하거나 줌을 변경하더라도 검색 패널 목록이 유지되어, 지도 탐색 중에도 전체 검색 결과를 언제든 확인하고 선택할 수 있도록 함.</w:t>
       </w:r>
     </w:p>
     <w:p>

</xml_diff>

<commit_message>
feat: implement auto bounds fit camera gliding on search query input and initial view reset on clear
</commit_message>
<xml_diff>
--- a/public/festival_service_spec.docx
+++ b/public/festival_service_spec.docx
@@ -1738,6 +1738,84 @@
       </w:pPr>
       <w:r>
         <w:t xml:space="preserve">**검색 결과와 지도 마커 100% 일치 정책**: 사용자가 검색창에 키워드를 입력하거나 진행 상태 필터를 변경하면, 검색 패널의 축제 목록과 지도 상에 표시되는 모든 마커가 완전히 동일한 데이터 집합으로 동기화됨. 지도를 이동하더라도 목록의 축제가 임의로 제외되거나 마커가 사라지지 않음.</w:t>
+      </w:r>
+    </w:p>
+    <w:p>
+      <w:pPr>
+        <w:pStyle w:val="ListParagraph"/>
+        <w:numPr>
+          <w:ilvl w:val="0"/>
+          <w:numId w:val="1"/>
+        </w:numPr>
+        <w:spacing w:after="60"/>
+      </w:pPr>
+      <w:r>
+        <w:t xml:space="preserve">**검색어 입력 시 카메라 자동 영역 맞춤 정책 (Bounds Fit)**:</w:t>
+      </w:r>
+    </w:p>
+    <w:p>
+      <w:pPr>
+        <w:pStyle w:val="ListParagraph"/>
+        <w:numPr>
+          <w:ilvl w:val="0"/>
+          <w:numId w:val="1"/>
+        </w:numPr>
+        <w:spacing w:after="60"/>
+      </w:pPr>
+      <w:r>
+        <w:t xml:space="preserve">사용자가 검색창에 특정 지역명이나 키워드(예: '서울', '부산', '벚꽃' 등)를 입력하면, 검색된 모든 축제 마커가 화면 안에 온전히 들어오는 최적의 좌표 범위와 줌 레벨을 자동 계산하여 카메라가 해당 지역으로 즉시 글라이딩 이동함.</w:t>
+      </w:r>
+    </w:p>
+    <w:p>
+      <w:pPr>
+        <w:pStyle w:val="ListParagraph"/>
+        <w:numPr>
+          <w:ilvl w:val="0"/>
+          <w:numId w:val="1"/>
+        </w:numPr>
+        <w:spacing w:after="60"/>
+      </w:pPr>
+      <w:r>
+        <w:t xml:space="preserve">PC 환경에서는 좌측 고정 패널(390px)에 마커가 가려지지 않도록 좌측 여백을 충분히 반영하여 우측 가시 영역 중앙에 마커 무리가 위치하도록 보정함.</w:t>
+      </w:r>
+    </w:p>
+    <w:p>
+      <w:pPr>
+        <w:pStyle w:val="ListParagraph"/>
+        <w:numPr>
+          <w:ilvl w:val="0"/>
+          <w:numId w:val="1"/>
+        </w:numPr>
+        <w:spacing w:after="60"/>
+      </w:pPr>
+      <w:r>
+        <w:t xml:space="preserve">검색 결과가 단 1개인 경우 해당 축제 상세 위치를 확대(레벨 7) 포커싱함.</w:t>
+      </w:r>
+    </w:p>
+    <w:p>
+      <w:pPr>
+        <w:pStyle w:val="ListParagraph"/>
+        <w:numPr>
+          <w:ilvl w:val="0"/>
+          <w:numId w:val="1"/>
+        </w:numPr>
+        <w:spacing w:after="60"/>
+      </w:pPr>
+      <w:r>
+        <w:t xml:space="preserve">**검색어 삭제(X 버튼) 시 초기 전국 뷰 복귀 정책**:</w:t>
+      </w:r>
+    </w:p>
+    <w:p>
+      <w:pPr>
+        <w:pStyle w:val="ListParagraph"/>
+        <w:numPr>
+          <w:ilvl w:val="0"/>
+          <w:numId w:val="1"/>
+        </w:numPr>
+        <w:spacing w:after="60"/>
+      </w:pPr>
+      <w:r>
+        <w:t xml:space="preserve">검색창 우측의 삭제(X) 버튼을 클릭하여 검색어를 지우면 필터가 기본값으로 초기화됨과 동시에, 지도 카메라가 초기 대한민국 전국 뷰(전체 조망)로 부드럽게 복귀함.</w:t>
       </w:r>
     </w:p>
     <w:p>

</xml_diff>

<commit_message>
feat: explicit search submit via Enter key and search icon with robust bounds fit camera alignment and immediate clear
</commit_message>
<xml_diff>
--- a/public/festival_service_spec.docx
+++ b/public/festival_service_spec.docx
@@ -1737,46 +1737,85 @@
         <w:spacing w:after="60"/>
       </w:pPr>
       <w:r>
-        <w:t xml:space="preserve">**검색 결과와 지도 마커 100% 일치 정책**: 사용자가 검색창에 키워드를 입력하거나 진행 상태 필터를 변경하면, 검색 패널의 축제 목록과 지도 상에 표시되는 모든 마커가 완전히 동일한 데이터 집합으로 동기화됨. 지도를 이동하더라도 목록의 축제가 임의로 제외되거나 마커가 사라지지 않음.</w:t>
-      </w:r>
-    </w:p>
-    <w:p>
-      <w:pPr>
-        <w:pStyle w:val="ListParagraph"/>
-        <w:numPr>
-          <w:ilvl w:val="0"/>
-          <w:numId w:val="1"/>
-        </w:numPr>
-        <w:spacing w:after="60"/>
-      </w:pPr>
-      <w:r>
-        <w:t xml:space="preserve">**검색어 입력 시 카메라 자동 영역 맞춤 정책 (Bounds Fit)**:</w:t>
-      </w:r>
-    </w:p>
-    <w:p>
-      <w:pPr>
-        <w:pStyle w:val="ListParagraph"/>
-        <w:numPr>
-          <w:ilvl w:val="0"/>
-          <w:numId w:val="1"/>
-        </w:numPr>
-        <w:spacing w:after="60"/>
-      </w:pPr>
-      <w:r>
-        <w:t xml:space="preserve">사용자가 검색창에 특정 지역명이나 키워드(예: '서울', '부산', '벚꽃' 등)를 입력하면, 검색된 모든 축제 마커가 화면 안에 온전히 들어오는 최적의 좌표 범위와 줌 레벨을 자동 계산하여 카메라가 해당 지역으로 즉시 글라이딩 이동함.</w:t>
-      </w:r>
-    </w:p>
-    <w:p>
-      <w:pPr>
-        <w:pStyle w:val="ListParagraph"/>
-        <w:numPr>
-          <w:ilvl w:val="0"/>
-          <w:numId w:val="1"/>
-        </w:numPr>
-        <w:spacing w:after="60"/>
-      </w:pPr>
-      <w:r>
-        <w:t xml:space="preserve">PC 환경에서는 좌측 고정 패널(390px)에 마커가 가려지지 않도록 좌측 여백을 충분히 반영하여 우측 가시 영역 중앙에 마커 무리가 위치하도록 보정함.</w:t>
+        <w:t xml:space="preserve">**검색 결과와 지도 마커 100% 일치 정책**: 사용자가 검색창에 키워드를 검색하거나 진행 상태 필터를 변경하면, 검색 패널의 축제 목록과 지도 상에 표시되는 모든 마커가 완전히 동일한 데이터 집합으로 동기화됨. 지도를 이동하더라도 목록의 축제가 임의로 제외되거나 마커가 사라지지 않음.</w:t>
+      </w:r>
+    </w:p>
+    <w:p>
+      <w:pPr>
+        <w:pStyle w:val="ListParagraph"/>
+        <w:numPr>
+          <w:ilvl w:val="0"/>
+          <w:numId w:val="1"/>
+        </w:numPr>
+        <w:spacing w:after="60"/>
+      </w:pPr>
+      <w:r>
+        <w:t xml:space="preserve">**검색 실행 트리거 정책 (엔터 및 검색 버튼)**:</w:t>
+      </w:r>
+    </w:p>
+    <w:p>
+      <w:pPr>
+        <w:pStyle w:val="ListParagraph"/>
+        <w:numPr>
+          <w:ilvl w:val="0"/>
+          <w:numId w:val="1"/>
+        </w:numPr>
+        <w:spacing w:after="60"/>
+      </w:pPr>
+      <w:r>
+        <w:t xml:space="preserve">타이핑 중 지도 화면이 덜컹거리거나 데이터가 꼬이는 현상을 방지하기 위해, 사용자가 검색창에 키워드를 입력한 후 **[Enter] 키를 누르거나 좌측 [돋보기 아이콘]을 클릭했을 때에만** 검색이 최종 실행됨.</w:t>
+      </w:r>
+    </w:p>
+    <w:p>
+      <w:pPr>
+        <w:pStyle w:val="ListParagraph"/>
+        <w:numPr>
+          <w:ilvl w:val="0"/>
+          <w:numId w:val="1"/>
+        </w:numPr>
+        <w:spacing w:after="60"/>
+      </w:pPr>
+      <w:r>
+        <w:t xml:space="preserve">상단 추천 테마 배너(한경 트래블 PICK 등)는 별도 타이핑이 없는 원클릭 단축 버튼이므로, 배너 클릭 즉시 해당 큐레이션 검색이 실행됨.</w:t>
+      </w:r>
+    </w:p>
+    <w:p>
+      <w:pPr>
+        <w:pStyle w:val="ListParagraph"/>
+        <w:numPr>
+          <w:ilvl w:val="0"/>
+          <w:numId w:val="1"/>
+        </w:numPr>
+        <w:spacing w:after="60"/>
+      </w:pPr>
+      <w:r>
+        <w:t xml:space="preserve">**검색어 실행 시 카메라 자동 영역 맞춤 정책 (Bounds Fit)**:</w:t>
+      </w:r>
+    </w:p>
+    <w:p>
+      <w:pPr>
+        <w:pStyle w:val="ListParagraph"/>
+        <w:numPr>
+          <w:ilvl w:val="0"/>
+          <w:numId w:val="1"/>
+        </w:numPr>
+        <w:spacing w:after="60"/>
+      </w:pPr>
+      <w:r>
+        <w:t xml:space="preserve">검색이 실행되면 검색된 모든 축제 마커가 화면 안에 온전히 들어오는 최적의 좌표 범위와 줌 레벨을 자동 계산하여 카메라가 해당 지역(예: 서울 검색 시 서울 전역 마커 군집)으로 즉시 글라이딩 이동함.</w:t>
+      </w:r>
+    </w:p>
+    <w:p>
+      <w:pPr>
+        <w:pStyle w:val="ListParagraph"/>
+        <w:numPr>
+          <w:ilvl w:val="0"/>
+          <w:numId w:val="1"/>
+        </w:numPr>
+        <w:spacing w:after="60"/>
+      </w:pPr>
+      <w:r>
+        <w:t xml:space="preserve">PC 환경에서는 좌측 고정 패널(390px)에 마커가 가려지지 않도록 좌측 패딩(420px)을 충분히 반영하여 우측 가시 영역 중앙에 마커 무리가 위치하도록 보정함.</w:t>
       </w:r>
     </w:p>
     <w:p>
@@ -1802,20 +1841,20 @@
         <w:spacing w:after="60"/>
       </w:pPr>
       <w:r>
-        <w:t xml:space="preserve">**검색어 삭제(X 버튼) 시 초기 전국 뷰 복귀 정책**:</w:t>
-      </w:r>
-    </w:p>
-    <w:p>
-      <w:pPr>
-        <w:pStyle w:val="ListParagraph"/>
-        <w:numPr>
-          <w:ilvl w:val="0"/>
-          <w:numId w:val="1"/>
-        </w:numPr>
-        <w:spacing w:after="60"/>
-      </w:pPr>
-      <w:r>
-        <w:t xml:space="preserve">검색창 우측의 삭제(X) 버튼을 클릭하여 검색어를 지우면 필터가 기본값으로 초기화됨과 동시에, 지도 카메라가 초기 대한민국 전국 뷰(전체 조망)로 부드럽게 복귀함.</w:t>
+        <w:t xml:space="preserve">**검색어 삭제(X 버튼) 시 즉시 초기화 및 전국 뷰 복귀 정책**:</w:t>
+      </w:r>
+    </w:p>
+    <w:p>
+      <w:pPr>
+        <w:pStyle w:val="ListParagraph"/>
+        <w:numPr>
+          <w:ilvl w:val="0"/>
+          <w:numId w:val="1"/>
+        </w:numPr>
+        <w:spacing w:after="60"/>
+      </w:pPr>
+      <w:r>
+        <w:t xml:space="preserve">검색창 우측의 삭제(X) 버튼을 클릭하면 엔터 조작 없이 즉시 입력창 텍스트가 지워지고 필터가 기본값으로 초기화됨과 동시에, 지도 카메라가 초기 대한민국 전국 뷰(전체 조망)로 부드럽게 복귀함.</w:t>
       </w:r>
     </w:p>
     <w:p>

</xml_diff>

<commit_message>
feat: focus on first search result with fixed zoom level 8
</commit_message>
<xml_diff>
--- a/public/festival_service_spec.docx
+++ b/public/festival_service_spec.docx
@@ -1789,46 +1789,46 @@
         <w:spacing w:after="60"/>
       </w:pPr>
       <w:r>
-        <w:t xml:space="preserve">**검색어 실행 시 카메라 자동 영역 맞춤 정책 (Bounds Fit)**:</w:t>
-      </w:r>
-    </w:p>
-    <w:p>
-      <w:pPr>
-        <w:pStyle w:val="ListParagraph"/>
-        <w:numPr>
-          <w:ilvl w:val="0"/>
-          <w:numId w:val="1"/>
-        </w:numPr>
-        <w:spacing w:after="60"/>
-      </w:pPr>
-      <w:r>
-        <w:t xml:space="preserve">검색이 실행되면 검색된 모든 축제 마커가 화면 안에 온전히 들어오는 최적의 좌표 범위와 줌 레벨을 자동 계산하여 카메라가 해당 지역(예: 서울 검색 시 서울 전역 마커 군집)으로 즉시 글라이딩 이동함.</w:t>
-      </w:r>
-    </w:p>
-    <w:p>
-      <w:pPr>
-        <w:pStyle w:val="ListParagraph"/>
-        <w:numPr>
-          <w:ilvl w:val="0"/>
-          <w:numId w:val="1"/>
-        </w:numPr>
-        <w:spacing w:after="60"/>
-      </w:pPr>
-      <w:r>
-        <w:t xml:space="preserve">PC 환경에서는 좌측 고정 패널(390px)에 마커가 가려지지 않도록 좌측 패딩(420px)을 충분히 반영하여 우측 가시 영역 중앙에 마커 무리가 위치하도록 보정함.</w:t>
-      </w:r>
-    </w:p>
-    <w:p>
-      <w:pPr>
-        <w:pStyle w:val="ListParagraph"/>
-        <w:numPr>
-          <w:ilvl w:val="0"/>
-          <w:numId w:val="1"/>
-        </w:numPr>
-        <w:spacing w:after="60"/>
-      </w:pPr>
-      <w:r>
-        <w:t xml:space="preserve">검색 결과가 단 1개인 경우 해당 축제 상세 위치를 확대(레벨 7) 포커싱함.</w:t>
+        <w:t xml:space="preserve">**검색어 실행 시 카메라 포커싱 정책 (첫 번째 결과 중심 + 레벨 8)**:</w:t>
+      </w:r>
+    </w:p>
+    <w:p>
+      <w:pPr>
+        <w:pStyle w:val="ListParagraph"/>
+        <w:numPr>
+          <w:ilvl w:val="0"/>
+          <w:numId w:val="1"/>
+        </w:numPr>
+        <w:spacing w:after="60"/>
+      </w:pPr>
+      <w:r>
+        <w:t xml:space="preserve">검색이 실행되면 검색 결과 목록의 **첫 번째 축제 위치를 중심점**으로 하여 지도 카메라가 글라이딩 이동함.</w:t>
+      </w:r>
+    </w:p>
+    <w:p>
+      <w:pPr>
+        <w:pStyle w:val="ListParagraph"/>
+        <w:numPr>
+          <w:ilvl w:val="0"/>
+          <w:numId w:val="1"/>
+        </w:numPr>
+        <w:spacing w:after="60"/>
+      </w:pPr>
+      <w:r>
+        <w:t xml:space="preserve">줌 레벨은 도시 전역을 시원하게 조망할 수 있는 **레벨 8로 고정**하여, 과도한 줌아웃이나 축소를 방지하고 인근 축제 마커들까지 자연스럽게 시야에 들어오도록 함.</w:t>
+      </w:r>
+    </w:p>
+    <w:p>
+      <w:pPr>
+        <w:pStyle w:val="ListParagraph"/>
+        <w:numPr>
+          <w:ilvl w:val="0"/>
+          <w:numId w:val="1"/>
+        </w:numPr>
+        <w:spacing w:after="60"/>
+      </w:pPr>
+      <w:r>
+        <w:t xml:space="preserve">PC 환경에서는 좌측 고정 패널(390px)에 가려지지 않도록 우측 가시 영역 중앙으로 중심점 오프셋(200px)을 자동 보정함.</w:t>
       </w:r>
     </w:p>
     <w:p>

</xml_diff>